<commit_message>
Fix Exhibit 2/3 annotation grammar; add deliverables links
- Apply grammar corrections and sync the author's Word edits into the markdown
  (now canonical): "far more than any other G7," "overclaim,"
  "difference-in-differences," "This lets us expand the argument slightly,"
  plus introductory commas; keep the simplified Ex 2 and EU-reliance Ex 3 framing.
- Add a "Supporting materials" block linking the GitHub repository and the AI
  interaction log.
- Rebuild Exhibit_Document.pdf and .docx from the markdown.

Co-Authored-By: Claude Opus 4.8 <noreply@anthropic.com>
</commit_message>
<xml_diff>
--- a/exhibits/Exhibit_Document.docx
+++ b/exhibits/Exhibit_Document.docx
@@ -2,7 +2,7 @@
 <file path=word/document.xml><?xml version="1.0" encoding="utf-8"?>
 <w:document xmlns:w="http://schemas.openxmlformats.org/wordprocessingml/2006/main" xmlns:m="http://schemas.openxmlformats.org/officeDocument/2006/math" xmlns:r="http://schemas.openxmlformats.org/officeDocument/2006/relationships" xmlns:o="urn:schemas-microsoft-com:office:office" xmlns:v="urn:schemas-microsoft-com:vml" xmlns:w10="urn:schemas-microsoft-com:office:word" xmlns:a="http://schemas.openxmlformats.org/drawingml/2006/main" xmlns:pic="http://schemas.openxmlformats.org/drawingml/2006/picture" xmlns:wp="http://schemas.openxmlformats.org/drawingml/2006/wordprocessingDrawing">
   <w:body>
-    <w:bookmarkStart w:id="34" w:name="Xf44c2f2c298e9323e91e97674478b7a7a9160c9"/>
+    <w:bookmarkStart w:id="36" w:name="Xf44c2f2c298e9323e91e97674478b7a7a9160c9"/>
     <w:p>
       <w:pPr>
         <w:pStyle w:val="Heading1"/>
@@ -148,6 +148,70 @@
         <w:pStyle w:val="BodyText"/>
       </w:pPr>
       <w:r>
+        <w:rPr>
+          <w:bCs/>
+          <w:b/>
+        </w:rPr>
+        <w:t xml:space="preserve">Supporting materials.</w:t>
+      </w:r>
+      <w:r>
+        <w:t xml:space="preserve"> </w:t>
+      </w:r>
+      <w:r>
+        <w:t xml:space="preserve">Full code, data, and step-by-step reproduction</w:t>
+      </w:r>
+      <w:r>
+        <w:t xml:space="preserve"> </w:t>
+      </w:r>
+      <w:r>
+        <w:t xml:space="preserve">instructions are in the project’s GitHub repository:</w:t>
+      </w:r>
+      <w:r>
+        <w:t xml:space="preserve"> </w:t>
+      </w:r>
+      <w:hyperlink r:id="rId22">
+        <w:r>
+          <w:rPr>
+            <w:rStyle w:val="Hyperlink"/>
+          </w:rPr>
+          <w:t xml:space="preserve">github.com/felix-aidala/Cardinal40-Technical</w:t>
+        </w:r>
+      </w:hyperlink>
+      <w:r>
+        <w:t xml:space="preserve">.</w:t>
+      </w:r>
+      <w:r>
+        <w:t xml:space="preserve"> </w:t>
+      </w:r>
+      <w:r>
+        <w:t xml:space="preserve">The complete log of substantive AI-tool interactions — how each tool was used and</w:t>
+      </w:r>
+      <w:r>
+        <w:t xml:space="preserve"> </w:t>
+      </w:r>
+      <w:r>
+        <w:t xml:space="preserve">how AI-generated statistics and citations were independently verified — is at</w:t>
+      </w:r>
+      <w:r>
+        <w:t xml:space="preserve"> </w:t>
+      </w:r>
+      <w:hyperlink r:id="rId23">
+        <w:r>
+          <w:rPr>
+            <w:rStyle w:val="VerbatimChar"/>
+          </w:rPr>
+          <w:t xml:space="preserve">logs/ai_interaction_log.md</w:t>
+        </w:r>
+      </w:hyperlink>
+      <w:r>
+        <w:t xml:space="preserve">.</w:t>
+      </w:r>
+    </w:p>
+    <w:p>
+      <w:pPr>
+        <w:pStyle w:val="BodyText"/>
+      </w:pPr>
+      <w:r>
         <w:t xml:space="preserve">The three exhibits trace one logical chain:</w:t>
       </w:r>
     </w:p>
@@ -224,7 +288,7 @@
         </w:pict>
       </w:r>
     </w:p>
-    <w:bookmarkStart w:id="25" w:name="Xc9c252e61360d445ffc09f523c6a88bd09ce87b"/>
+    <w:bookmarkStart w:id="27" w:name="Xc9c252e61360d445ffc09f523c6a88bd09ce87b"/>
     <w:p>
       <w:pPr>
         <w:pStyle w:val="Heading2"/>
@@ -253,7 +317,7 @@
                     </pic:cNvPicPr>
                   </pic:nvPicPr>
                   <pic:blipFill>
-                    <a:blip r:embed="rId22"/>
+                    <a:blip r:embed="rId24"/>
                     <a:stretch>
                       <a:fillRect/>
                     </a:stretch>
@@ -321,7 +385,13 @@
         <w:t xml:space="preserve"> </w:t>
       </w:r>
       <w:r>
-        <w:t xml:space="preserve">academics, working for the federal government on leave from their universities;</w:t>
+        <w:t xml:space="preserve">largely academics, working for the federal government on leave from their</w:t>
+      </w:r>
+      <w:r>
+        <w:t xml:space="preserve"> </w:t>
+      </w:r>
+      <w:r>
+        <w:t xml:space="preserve">universities;</w:t>
       </w:r>
       <w:r>
         <w:t xml:space="preserve"> </w:t>
@@ -632,7 +702,7 @@
       <w:r>
         <w:t xml:space="preserve"> </w:t>
       </w:r>
-      <w:hyperlink r:id="rId23">
+      <w:hyperlink r:id="rId25">
         <w:r>
           <w:rPr>
             <w:rStyle w:val="VerbatimChar"/>
@@ -649,7 +719,7 @@
       <w:r>
         <w:t xml:space="preserve"> </w:t>
       </w:r>
-      <w:hyperlink r:id="rId24">
+      <w:hyperlink r:id="rId26">
         <w:r>
           <w:rPr>
             <w:rStyle w:val="VerbatimChar"/>
@@ -668,8 +738,8 @@
         </w:pict>
       </w:r>
     </w:p>
-    <w:bookmarkEnd w:id="25"/>
-    <w:bookmarkStart w:id="29" w:name="Xfb996ad2527edc35439b2aad74d80e30267dc8a"/>
+    <w:bookmarkEnd w:id="27"/>
+    <w:bookmarkStart w:id="31" w:name="Xfb996ad2527edc35439b2aad74d80e30267dc8a"/>
     <w:p>
       <w:pPr>
         <w:pStyle w:val="Heading2"/>
@@ -698,7 +768,7 @@
                     </pic:cNvPicPr>
                   </pic:nvPicPr>
                   <pic:blipFill>
-                    <a:blip r:embed="rId26"/>
+                    <a:blip r:embed="rId28"/>
                     <a:stretch>
                       <a:fillRect/>
                     </a:stretch>
@@ -778,13 +848,13 @@
         <w:t xml:space="preserve"> </w:t>
       </w:r>
       <w:r>
-        <w:t xml:space="preserve">read, because what they plot is a difference-in-differences rather than a simple</w:t>
-      </w:r>
-      <w:r>
-        <w:t xml:space="preserve"> </w:t>
-      </w:r>
-      <w:r>
-        <w:t xml:space="preserve">time trend; given more time, I would replicate the authors’ analysis myself so the</w:t>
+        <w:t xml:space="preserve">read, because they plot a difference-in-differences rather than a simple time</w:t>
+      </w:r>
+      <w:r>
+        <w:t xml:space="preserve"> </w:t>
+      </w:r>
+      <w:r>
+        <w:t xml:space="preserve">trend. Given more time, I would replicate the authors’ analysis myself so the</w:t>
       </w:r>
       <w:r>
         <w:t xml:space="preserve"> </w:t>
@@ -820,7 +890,31 @@
         <w:t xml:space="preserve"> </w:t>
       </w:r>
       <w:r>
-        <w:t xml:space="preserve">the shaded 95% confidence band widens after the switch, so the</w:t>
+        <w:t xml:space="preserve">this is just one academic paper, so it should be presented as</w:t>
+      </w:r>
+      <w:r>
+        <w:t xml:space="preserve"> </w:t>
+      </w:r>
+      <w:r>
+        <w:t xml:space="preserve">a finding rather than a fact. Also, I present the authors’ figures; I did not</w:t>
+      </w:r>
+      <w:r>
+        <w:t xml:space="preserve"> </w:t>
+      </w:r>
+      <w:r>
+        <w:t xml:space="preserve">re-run the analysis myself.</w:t>
+      </w:r>
+    </w:p>
+    <w:p>
+      <w:pPr>
+        <w:pStyle w:val="BodyText"/>
+      </w:pPr>
+      <w:r>
+        <w:rPr>
+          <w:bCs/>
+          <w:b/>
+        </w:rPr>
+        <w:t xml:space="preserve">Sources.</w:t>
       </w:r>
       <w:r>
         <w:t xml:space="preserve"> </w:t>
@@ -830,19 +924,37 @@
           <w:iCs/>
           <w:i/>
         </w:rPr>
-        <w:t xml:space="preserve">later</w:t>
-      </w:r>
-      <w:r>
-        <w:t xml:space="preserve"> </w:t>
-      </w:r>
-      <w:r>
-        <w:t xml:space="preserve">post-switch points are imprecisely estimated; read the result as the clear</w:t>
-      </w:r>
-      <w:r>
-        <w:t xml:space="preserve"> </w:t>
-      </w:r>
-      <w:r>
-        <w:t xml:space="preserve">break at year 0 plus the published magnitude, not as a precise year-by-year path.</w:t>
+        <w:t xml:space="preserve">Event-study figure:</w:t>
+      </w:r>
+      <w:r>
+        <w:t xml:space="preserve"> </w:t>
+      </w:r>
+      <w:r>
+        <w:t xml:space="preserve">Lee, Joon Mahn; Kim, Jongsoo; Bae, Joonhyung,</w:t>
+      </w:r>
+      <w:r>
+        <w:t xml:space="preserve"> </w:t>
+      </w:r>
+      <w:r>
+        <w:t xml:space="preserve">“</w:t>
+      </w:r>
+      <w:r>
+        <w:t xml:space="preserve">Are Founder CEOs Better Innovators? Evidence from S&amp;P 500 Firms</w:t>
+      </w:r>
+      <w:r>
+        <w:t xml:space="preserve">”</w:t>
+      </w:r>
+      <w:r>
+        <w:t xml:space="preserve"> </w:t>
+      </w:r>
+      <w:r>
+        <w:t xml:space="preserve">(Wharton Mack</w:t>
+      </w:r>
+      <w:r>
+        <w:t xml:space="preserve"> </w:t>
+      </w:r>
+      <w:r>
+        <w:t xml:space="preserve">Institute working paper; S&amp;P 500, 1993–2003),</w:t>
       </w:r>
       <w:r>
         <w:t xml:space="preserve"> </w:t>
@@ -852,142 +964,10 @@
           <w:bCs/>
           <w:b/>
         </w:rPr>
-        <w:t xml:space="preserve">The rigorously-identified magnitude</w:t>
-      </w:r>
-      <w:r>
-        <w:t xml:space="preserve"> </w:t>
-      </w:r>
-      <w:r>
-        <w:t xml:space="preserve">comes from the peer-reviewed analysis,</w:t>
-      </w:r>
-      <w:r>
-        <w:t xml:space="preserve"> </w:t>
-      </w:r>
-      <w:r>
-        <w:t xml:space="preserve">which isolates causation using CEO</w:t>
-      </w:r>
-      <w:r>
-        <w:t xml:space="preserve"> </w:t>
-      </w:r>
-      <w:r>
-        <w:rPr>
-          <w:iCs/>
-          <w:i/>
-        </w:rPr>
-        <w:t xml:space="preserve">sudden deaths</w:t>
-      </w:r>
-      <w:r>
-        <w:t xml:space="preserve"> </w:t>
-      </w:r>
-      <w:r>
-        <w:t xml:space="preserve">and reports a</w:t>
-      </w:r>
-      <w:r>
-        <w:t xml:space="preserve"> </w:t>
-      </w:r>
-      <w:r>
-        <w:rPr>
-          <w:bCs/>
-          <w:b/>
-        </w:rPr>
-        <w:t xml:space="preserve">~43.8% drop in</w:t>
-      </w:r>
-      <w:r>
-        <w:rPr>
-          <w:bCs/>
-          <w:b/>
-        </w:rPr>
-        <w:t xml:space="preserve"> </w:t>
-      </w:r>
-      <w:r>
-        <w:rPr>
-          <w:bCs/>
-          <w:b/>
-        </w:rPr>
-        <w:t xml:space="preserve">citation-weighted patents</w:t>
-      </w:r>
-      <w:r>
-        <w:t xml:space="preserve"> </w:t>
-      </w:r>
-      <w:r>
-        <w:t xml:space="preserve">(controlling for R&amp;D — founders manage and</w:t>
-      </w:r>
-      <w:r>
-        <w:t xml:space="preserve"> </w:t>
-      </w:r>
-      <w:r>
-        <w:rPr>
-          <w:iCs/>
-          <w:i/>
-        </w:rPr>
-        <w:t xml:space="preserve">retain</w:t>
-      </w:r>
-      <w:r>
-        <w:t xml:space="preserve"> </w:t>
-      </w:r>
-      <w:r>
-        <w:t xml:space="preserve">inventors better, they don’t simply spend more). I</w:t>
-      </w:r>
-      <w:r>
-        <w:t xml:space="preserve"> </w:t>
-      </w:r>
-      <w:r>
-        <w:rPr>
-          <w:bCs/>
-          <w:b/>
-        </w:rPr>
-        <w:t xml:space="preserve">present the authors’</w:t>
-      </w:r>
-      <w:r>
-        <w:rPr>
-          <w:bCs/>
-          <w:b/>
-        </w:rPr>
-        <w:t xml:space="preserve"> </w:t>
-      </w:r>
-      <w:r>
-        <w:rPr>
-          <w:bCs/>
-          <w:b/>
-        </w:rPr>
-        <w:t xml:space="preserve">figures</w:t>
-      </w:r>
-      <w:r>
-        <w:t xml:space="preserve">; I did not re-run the analysis, whose hand-collected data are not</w:t>
-      </w:r>
-      <w:r>
-        <w:t xml:space="preserve"> </w:t>
-      </w:r>
-      <w:r>
-        <w:t xml:space="preserve">redistributable.</w:t>
-      </w:r>
-    </w:p>
-    <w:p>
-      <w:pPr>
-        <w:pStyle w:val="BodyText"/>
-      </w:pPr>
-      <w:r>
-        <w:rPr>
-          <w:bCs/>
-          <w:b/>
-        </w:rPr>
-        <w:t xml:space="preserve">Sources.</w:t>
-      </w:r>
-      <w:r>
-        <w:t xml:space="preserve"> </w:t>
-      </w:r>
-      <w:r>
-        <w:rPr>
-          <w:iCs/>
-          <w:i/>
-        </w:rPr>
-        <w:t xml:space="preserve">Event-study figure:</w:t>
-      </w:r>
-      <w:r>
-        <w:t xml:space="preserve"> </w:t>
-      </w:r>
-      <w:r>
-        <w:t xml:space="preserve">Lee, Joon Mahn; Kim, Jongsoo; Bae, Joonhyung,</w:t>
+        <w:t xml:space="preserve">Figure 2</w:t>
+      </w:r>
+      <w:r>
+        <w:t xml:space="preserve">,</w:t>
       </w:r>
       <w:r>
         <w:t xml:space="preserve"> </w:t>
@@ -996,7 +976,13 @@
         <w:t xml:space="preserve">“</w:t>
       </w:r>
       <w:r>
-        <w:t xml:space="preserve">Are Founder CEOs Better Innovators? Evidence from S&amp;P 500 Firms</w:t>
+        <w:t xml:space="preserve">Switching from</w:t>
+      </w:r>
+      <w:r>
+        <w:t xml:space="preserve"> </w:t>
+      </w:r>
+      <w:r>
+        <w:t xml:space="preserve">Founder CEO to Professional CEO.</w:t>
       </w:r>
       <w:r>
         <w:t xml:space="preserve">”</w:t>
@@ -1005,49 +991,6 @@
         <w:t xml:space="preserve"> </w:t>
       </w:r>
       <w:r>
-        <w:t xml:space="preserve">(Wharton Mack</w:t>
-      </w:r>
-      <w:r>
-        <w:t xml:space="preserve"> </w:t>
-      </w:r>
-      <w:r>
-        <w:t xml:space="preserve">Institute working paper; S&amp;P 500, 1993–2003),</w:t>
-      </w:r>
-      <w:r>
-        <w:t xml:space="preserve"> </w:t>
-      </w:r>
-      <w:r>
-        <w:rPr>
-          <w:bCs/>
-          <w:b/>
-        </w:rPr>
-        <w:t xml:space="preserve">Figure 2</w:t>
-      </w:r>
-      <w:r>
-        <w:t xml:space="preserve">,</w:t>
-      </w:r>
-      <w:r>
-        <w:t xml:space="preserve"> </w:t>
-      </w:r>
-      <w:r>
-        <w:t xml:space="preserve">“</w:t>
-      </w:r>
-      <w:r>
-        <w:t xml:space="preserve">Switching from</w:t>
-      </w:r>
-      <w:r>
-        <w:t xml:space="preserve"> </w:t>
-      </w:r>
-      <w:r>
-        <w:t xml:space="preserve">Founder CEO to Professional CEO.</w:t>
-      </w:r>
-      <w:r>
-        <w:t xml:space="preserve">”</w:t>
-      </w:r>
-      <w:r>
-        <w:t xml:space="preserve"> </w:t>
-      </w:r>
-      <w:r>
         <w:t xml:space="preserve">Values digitized from the published chart</w:t>
       </w:r>
       <w:r>
@@ -1059,7 +1002,7 @@
       <w:r>
         <w:t xml:space="preserve"> </w:t>
       </w:r>
-      <w:hyperlink r:id="rId27">
+      <w:hyperlink r:id="rId29">
         <w:r>
           <w:rPr>
             <w:rStyle w:val="VerbatimChar"/>
@@ -1129,7 +1072,7 @@
       <w:r>
         <w:t xml:space="preserve"> </w:t>
       </w:r>
-      <w:hyperlink r:id="rId28">
+      <w:hyperlink r:id="rId30">
         <w:r>
           <w:rPr>
             <w:rStyle w:val="VerbatimChar"/>
@@ -1176,8 +1119,8 @@
         </w:pict>
       </w:r>
     </w:p>
-    <w:bookmarkEnd w:id="29"/>
-    <w:bookmarkStart w:id="33" w:name="X087a9e8ea75dd2d5f00314e6ad3fd8d4b14e4a4"/>
+    <w:bookmarkEnd w:id="31"/>
+    <w:bookmarkStart w:id="35" w:name="X087a9e8ea75dd2d5f00314e6ad3fd8d4b14e4a4"/>
     <w:p>
       <w:pPr>
         <w:pStyle w:val="Heading2"/>
@@ -1206,7 +1149,7 @@
                     </pic:cNvPicPr>
                   </pic:nvPicPr>
                   <pic:blipFill>
-                    <a:blip r:embed="rId30"/>
+                    <a:blip r:embed="rId32"/>
                     <a:stretch>
                       <a:fillRect/>
                     </a:stretch>
@@ -1262,13 +1205,73 @@
         <w:t xml:space="preserve"> </w:t>
       </w:r>
       <w:r>
-        <w:t xml:space="preserve">industry and that founders specifically are hard to replace. This one closes the</w:t>
-      </w:r>
-      <w:r>
-        <w:t xml:space="preserve"> </w:t>
-      </w:r>
-      <w:r>
-        <w:t xml:space="preserve">loop on the</w:t>
+        <w:t xml:space="preserve">industry and that founders specifically are hard to replace. This figure attempts</w:t>
+      </w:r>
+      <w:r>
+        <w:t xml:space="preserve"> </w:t>
+      </w:r>
+      <w:r>
+        <w:t xml:space="preserve">to display America’s unique ability to support them. Relative to the size of its</w:t>
+      </w:r>
+      <w:r>
+        <w:t xml:space="preserve"> </w:t>
+      </w:r>
+      <w:r>
+        <w:t xml:space="preserve">economy, the U.S. invests far more than any other G7 country — roughly 0.5% of</w:t>
+      </w:r>
+      <w:r>
+        <w:t xml:space="preserve"> </w:t>
+      </w:r>
+      <w:r>
+        <w:t xml:space="preserve">GDP in 2024, about 3× the U.K., 6× France, and 8–9× Germany and Japan.</w:t>
+      </w:r>
+      <w:r>
+        <w:t xml:space="preserve"> </w:t>
+      </w:r>
+      <w:r>
+        <w:rPr>
+          <w:bCs/>
+          <w:b/>
+        </w:rPr>
+        <w:t xml:space="preserve">Why show</w:t>
+      </w:r>
+      <w:r>
+        <w:rPr>
+          <w:bCs/>
+          <w:b/>
+        </w:rPr>
+        <w:t xml:space="preserve"> </w:t>
+      </w:r>
+      <w:r>
+        <w:rPr>
+          <w:bCs/>
+          <w:b/>
+        </w:rPr>
+        <w:t xml:space="preserve">peers rather than just China:</w:t>
+      </w:r>
+      <w:r>
+        <w:t xml:space="preserve"> </w:t>
+      </w:r>
+      <w:r>
+        <w:t xml:space="preserve">the contest with China is usually framed as a</w:t>
+      </w:r>
+      <w:r>
+        <w:t xml:space="preserve"> </w:t>
+      </w:r>
+      <w:r>
+        <w:t xml:space="preserve">two-country race, but particularly as the EU aims to lower its reliance on the</w:t>
+      </w:r>
+      <w:r>
+        <w:t xml:space="preserve"> </w:t>
+      </w:r>
+      <w:r>
+        <w:t xml:space="preserve">United States, it’s worth making the point that the capacity to finance founders</w:t>
+      </w:r>
+      <w:r>
+        <w:t xml:space="preserve"> </w:t>
+      </w:r>
+      <w:r>
+        <w:t xml:space="preserve">at scale is what determines who can credibly</w:t>
       </w:r>
       <w:r>
         <w:t xml:space="preserve"> </w:t>
@@ -1278,40 +1281,31 @@
           <w:iCs/>
           <w:i/>
         </w:rPr>
-        <w:t xml:space="preserve">system</w:t>
-      </w:r>
-      <w:r>
-        <w:t xml:space="preserve">: America doesn’t just produce valuable founders — it</w:t>
-      </w:r>
-      <w:r>
-        <w:t xml:space="preserve"> </w:t>
-      </w:r>
-      <w:r>
-        <w:t xml:space="preserve">bankrolls them at a scale no peer economy approaches. Venture capital is the fuel</w:t>
-      </w:r>
-      <w:r>
-        <w:t xml:space="preserve"> </w:t>
-      </w:r>
-      <w:r>
-        <w:t xml:space="preserve">that lets a founder take an expensive, uncertain swing, and relative to the size</w:t>
-      </w:r>
-      <w:r>
-        <w:t xml:space="preserve"> </w:t>
-      </w:r>
-      <w:r>
-        <w:t xml:space="preserve">of its economy the U.S. invests far more of it than any other G7 country —</w:t>
-      </w:r>
-      <w:r>
-        <w:t xml:space="preserve"> </w:t>
-      </w:r>
-      <w:r>
-        <w:t xml:space="preserve">roughly 0.5% of GDP in 2024, about 3× the U.K., 6× France, and 8–9× Germany and</w:t>
-      </w:r>
-      <w:r>
-        <w:t xml:space="preserve"> </w:t>
-      </w:r>
-      <w:r>
-        <w:t xml:space="preserve">Japan — a gap that widened markedly after 2018.</w:t>
+        <w:t xml:space="preserve">challenge</w:t>
+      </w:r>
+      <w:r>
+        <w:t xml:space="preserve"> </w:t>
+      </w:r>
+      <w:r>
+        <w:t xml:space="preserve">Beijing. On that measure,</w:t>
+      </w:r>
+      <w:r>
+        <w:t xml:space="preserve"> </w:t>
+      </w:r>
+      <w:r>
+        <w:t xml:space="preserve">the U.S. stands alone even among its closest allies. This lets us expand the</w:t>
+      </w:r>
+      <w:r>
+        <w:t xml:space="preserve"> </w:t>
+      </w:r>
+      <w:r>
+        <w:t xml:space="preserve">argument slightly. Showing the U.S. against its own peer group demonstrates that</w:t>
+      </w:r>
+      <w:r>
+        <w:t xml:space="preserve"> </w:t>
+      </w:r>
+      <w:r>
+        <w:t xml:space="preserve">America is the one country actually equipped to mount the challenge.</w:t>
       </w:r>
       <w:r>
         <w:t xml:space="preserve"> </w:t>
@@ -1321,7 +1315,7 @@
           <w:bCs/>
           <w:b/>
         </w:rPr>
-        <w:t xml:space="preserve">Why show peers rather than just</w:t>
+        <w:t xml:space="preserve">Nuance not</w:t>
       </w:r>
       <w:r>
         <w:rPr>
@@ -1335,25 +1329,13 @@
           <w:bCs/>
           <w:b/>
         </w:rPr>
-        <w:t xml:space="preserve">China:</w:t>
-      </w:r>
-      <w:r>
-        <w:t xml:space="preserve"> </w:t>
-      </w:r>
-      <w:r>
-        <w:t xml:space="preserve">the contest with China is usually framed as a two-country race, but that</w:t>
-      </w:r>
-      <w:r>
-        <w:t xml:space="preserve"> </w:t>
-      </w:r>
-      <w:r>
-        <w:t xml:space="preserve">framing hides the more telling fact — the capacity to finance founders at scale</w:t>
-      </w:r>
-      <w:r>
-        <w:t xml:space="preserve"> </w:t>
-      </w:r>
-      <w:r>
-        <w:t xml:space="preserve">is what determines who can credibly</w:t>
+        <w:t xml:space="preserve">to overclaim:</w:t>
+      </w:r>
+      <w:r>
+        <w:t xml:space="preserve"> </w:t>
+      </w:r>
+      <w:r>
+        <w:t xml:space="preserve">the U.S. is not the world leader on this ratio —</w:t>
       </w:r>
       <w:r>
         <w:t xml:space="preserve"> </w:t>
@@ -1363,53 +1345,43 @@
           <w:iCs/>
           <w:i/>
         </w:rPr>
-        <w:t xml:space="preserve">challenge</w:t>
-      </w:r>
-      <w:r>
-        <w:t xml:space="preserve"> </w:t>
-      </w:r>
-      <w:r>
-        <w:t xml:space="preserve">Beijing, and on that measure the</w:t>
-      </w:r>
-      <w:r>
-        <w:t xml:space="preserve"> </w:t>
-      </w:r>
-      <w:r>
-        <w:t xml:space="preserve">U.S. stands alone even among its closest allies. Showing the U.S. against its own</w:t>
-      </w:r>
-      <w:r>
-        <w:t xml:space="preserve"> </w:t>
-      </w:r>
-      <w:r>
-        <w:t xml:space="preserve">peer group, not just against China, is what demonstrates that America is the one</w:t>
-      </w:r>
-      <w:r>
-        <w:t xml:space="preserve"> </w:t>
-      </w:r>
-      <w:r>
-        <w:t xml:space="preserve">country actually equipped to mount the challenge.</w:t>
-      </w:r>
-      <w:r>
-        <w:t xml:space="preserve"> </w:t>
-      </w:r>
+        <w:t xml:space="preserve">Israel</w:t>
+      </w:r>
+      <w:r>
+        <w:t xml:space="preserve"> </w:t>
+      </w:r>
+      <w:r>
+        <w:t xml:space="preserve">invests</w:t>
+      </w:r>
+      <w:r>
+        <w:t xml:space="preserve"> </w:t>
+      </w:r>
+      <w:r>
+        <w:t xml:space="preserve">a larger share of its GDP (~1.8%). I scope the comparison to the G7, the large</w:t>
+      </w:r>
+      <w:r>
+        <w:t xml:space="preserve"> </w:t>
+      </w:r>
+      <w:r>
+        <w:t xml:space="preserve">advanced economies where the U.S. leads.</w:t>
+      </w:r>
+    </w:p>
+    <w:p>
+      <w:pPr>
+        <w:pStyle w:val="BodyText"/>
+      </w:pPr>
       <w:r>
         <w:rPr>
           <w:bCs/>
           <w:b/>
         </w:rPr>
-        <w:t xml:space="preserve">Nuance not to overclaim:</w:t>
-      </w:r>
-      <w:r>
-        <w:t xml:space="preserve"> </w:t>
-      </w:r>
-      <w:r>
-        <w:t xml:space="preserve">the</w:t>
-      </w:r>
-      <w:r>
-        <w:t xml:space="preserve"> </w:t>
-      </w:r>
-      <w:r>
-        <w:t xml:space="preserve">U.S. is not the world leader on this ratio —</w:t>
+        <w:t xml:space="preserve">Source.</w:t>
+      </w:r>
+      <w:r>
+        <w:t xml:space="preserve"> </w:t>
+      </w:r>
+      <w:r>
+        <w:t xml:space="preserve">OECD,</w:t>
       </w:r>
       <w:r>
         <w:t xml:space="preserve"> </w:t>
@@ -1419,70 +1391,6 @@
           <w:iCs/>
           <w:i/>
         </w:rPr>
-        <w:t xml:space="preserve">Israel</w:t>
-      </w:r>
-      <w:r>
-        <w:t xml:space="preserve"> </w:t>
-      </w:r>
-      <w:r>
-        <w:t xml:space="preserve">invests a larger share of</w:t>
-      </w:r>
-      <w:r>
-        <w:t xml:space="preserve"> </w:t>
-      </w:r>
-      <w:r>
-        <w:t xml:space="preserve">its GDP (~1.8%). I scope the comparison to the G7, the large advanced economies</w:t>
-      </w:r>
-      <w:r>
-        <w:t xml:space="preserve"> </w:t>
-      </w:r>
-      <w:r>
-        <w:t xml:space="preserve">where the U.S. leads, and flag Israel rather than bury it; note too that the</w:t>
-      </w:r>
-      <w:r>
-        <w:t xml:space="preserve"> </w:t>
-      </w:r>
-      <w:r>
-        <w:t xml:space="preserve">ranking reverses on absolute capital, where the U.S. (~$156B) is ~16× Israel</w:t>
-      </w:r>
-      <w:r>
-        <w:t xml:space="preserve"> </w:t>
-      </w:r>
-      <w:r>
-        <w:t xml:space="preserve">(~$10B). And this is venture capital specifically — one channel of startup</w:t>
-      </w:r>
-      <w:r>
-        <w:t xml:space="preserve"> </w:t>
-      </w:r>
-      <w:r>
-        <w:t xml:space="preserve">finance, not the whole of it.</w:t>
-      </w:r>
-    </w:p>
-    <w:p>
-      <w:pPr>
-        <w:pStyle w:val="BodyText"/>
-      </w:pPr>
-      <w:r>
-        <w:rPr>
-          <w:bCs/>
-          <w:b/>
-        </w:rPr>
-        <w:t xml:space="preserve">Source.</w:t>
-      </w:r>
-      <w:r>
-        <w:t xml:space="preserve"> </w:t>
-      </w:r>
-      <w:r>
-        <w:t xml:space="preserve">OECD,</w:t>
-      </w:r>
-      <w:r>
-        <w:t xml:space="preserve"> </w:t>
-      </w:r>
-      <w:r>
-        <w:rPr>
-          <w:iCs/>
-          <w:i/>
-        </w:rPr>
         <w:t xml:space="preserve">Entrepreneurship Financing Database</w:t>
       </w:r>
       <w:r>
@@ -1545,7 +1453,7 @@
       <w:r>
         <w:t xml:space="preserve"> </w:t>
       </w:r>
-      <w:hyperlink r:id="rId31">
+      <w:hyperlink r:id="rId33">
         <w:r>
           <w:rPr>
             <w:rStyle w:val="VerbatimChar"/>
@@ -1592,7 +1500,7 @@
         </w:pict>
       </w:r>
     </w:p>
-    <w:bookmarkStart w:id="32" w:name="how-to-reproduce"/>
+    <w:bookmarkStart w:id="34" w:name="how-to-reproduce"/>
     <w:p>
       <w:pPr>
         <w:pStyle w:val="Heading3"/>
@@ -1695,9 +1603,9 @@
         <w:t xml:space="preserve">the annotations above.</w:t>
       </w:r>
     </w:p>
-    <w:bookmarkEnd w:id="32"/>
-    <w:bookmarkEnd w:id="33"/>
     <w:bookmarkEnd w:id="34"/>
+    <w:bookmarkEnd w:id="35"/>
+    <w:bookmarkEnd w:id="36"/>
     <w:sectPr/>
   </w:body>
 </w:document>

</xml_diff>